<commit_message>
regenerate clean copy after Q1 restructure
Co-Authored-By: Claude Opus 5 <noreply@anthropic.com>
</commit_message>
<xml_diff>
--- a/rebuttal/rebuttal_v3.2_clean.docx
+++ b/rebuttal/rebuttal_v3.2_clean.docx
@@ -2,7 +2,7 @@
 <file path=word/document.xml><?xml version="1.0" encoding="utf-8"?>
 <w:document xmlns:w="http://schemas.openxmlformats.org/wordprocessingml/2006/main" xmlns:m="http://schemas.openxmlformats.org/officeDocument/2006/math" xmlns:r="http://schemas.openxmlformats.org/officeDocument/2006/relationships" xmlns:o="urn:schemas-microsoft-com:office:office" xmlns:v="urn:schemas-microsoft-com:vml" xmlns:w10="urn:schemas-microsoft-com:office:word" xmlns:a="http://schemas.openxmlformats.org/drawingml/2006/main" xmlns:pic="http://schemas.openxmlformats.org/drawingml/2006/picture" xmlns:wp="http://schemas.openxmlformats.org/drawingml/2006/wordprocessingDrawing">
   <w:body>
-    <w:bookmarkStart w:id="46" w:name="sharedos-pact-rebuttal-v3.2"/>
+    <w:bookmarkStart w:id="47" w:name="sharedos-pact-rebuttal-v3.2"/>
     <w:p>
       <w:pPr>
         <w:pStyle w:val="Heading1"/>
@@ -75,7 +75,7 @@
         <w:t xml:space="preserve"> </w:t>
       </w:r>
       <w:r>
-        <w:t xml:space="preserve">It was intended as conceptual framing, and we agree the measured object is a set of discrete operating points. We have (a) renamed it throughout to</w:t>
+        <w:t xml:space="preserve">We agree with the reviewer’s narrow terminological point: although the study already measures many operating points across policies, model configurations, data surfaces, interaction lengths, relationships, network settings, and architectural controls, it does not estimate a continuous Pareto boundary. We therefore rename the object throughout as</w:t>
       </w:r>
       <w:r>
         <w:t xml:space="preserve"> </w:t>
@@ -88,7 +88,7 @@
         <w:t xml:space="preserve">security–utility trade-offs across discrete operating points</w:t>
       </w:r>
       <w:r>
-        <w:t xml:space="preserve">, and (b) densified the point set to eight judged policy packages on one fixed 60-task/model setting (Table GR-4), plus three literature-derived defence prompts (Spotlighting, Instruction Hierarchy, Sandwich + Boundary) evaluated under the 240-tick multi-step protocol (reply to aP1N Q1). Separately, we vary the responder on one canonical 30-task subset (Table GR-3), so policy breadth and responder robustness are not conflated.</w:t>
+        <w:t xml:space="preserve">. The revision also makes the existing large-scale evidence explicit (Table GR-2a) and adds two matched controls requested in review: an eight-policy comparison on one fixed 60-task setting (Table GR-4) and a responder check on one fixed 30-task setting (Table GR-3). These controls improve attribution; they are not presented as the primary evidence of scale or as a fitted frontier.</w:t>
       </w:r>
     </w:p>
     <w:p>
@@ -195,7 +195,7 @@
       </w:r>
     </w:p>
     <w:bookmarkEnd w:id="20"/>
-    <w:bookmarkStart w:id="26" w:name="general-response-to-all-reviewers"/>
+    <w:bookmarkStart w:id="27" w:name="general-response-to-all-reviewers"/>
     <w:p>
       <w:pPr>
         <w:pStyle w:val="Heading2"/>
@@ -364,7 +364,7 @@
               <w:t xml:space="preserve">trade-offs across discrete operating points</w:t>
             </w:r>
             <w:r>
-              <w:t xml:space="preserve">; eight judged single-step policy packages (Table GR-4) plus three literature-derived defences at 240-tick multi-step (aP1N Q1), with responder robustness reported separately (Table GR-3)</w:t>
+              <w:t xml:space="preserve">; consolidated the already-evaluated policy/model/surface/network/architecture axes (Table GR-2a); added matched policy and responder controls without treating them as a Pareto estimate</w:t>
             </w:r>
           </w:p>
         </w:tc>
@@ -383,7 +383,7 @@
               <w:t xml:space="preserve">done</w:t>
             </w:r>
             <w:r>
-              <w:t xml:space="preserve">: 8 × 60 single-step evaluations, 3 multi-step defence packages, 4 × 30 responder-policy cells</w:t>
+              <w:t xml:space="preserve">: large-scale evidence in GR-1/GR-2a and detailed tables; reviewer-requested controls are 8 × 60 policy-task and 4 × 30 responder-policy cells</w:t>
             </w:r>
           </w:p>
         </w:tc>
@@ -953,15 +953,36 @@
         <w:pStyle w:val="BodyText"/>
       </w:pPr>
       <w:r>
-        <w:t xml:space="preserve">The completed supplemental evidence in this response comprises 480 policy-task episodes (8 policies × 60 tasks), 120 responder-policy episodes (4 cells × 30 tasks), 500 seeded relationship episodes, and 2,088 different-family judge calls. We report these units separately rather than inflating them into one heterogeneous trial count. The 600 additional States task responses planned for Table JD-2 are not included until strict finalization and judging complete.</w:t>
-      </w:r>
-    </w:p>
-    <w:p>
-      <w:pPr>
-        <w:pStyle w:val="BodyText"/>
-      </w:pPr>
-      <w:r>
-        <w:t xml:space="preserve">We also surface several previously completed evaluations that were compressed or omitted in the original response: the full two-model multi-turn matrix, requester-conditioned read/write results, PACT-NET task-family and network-native metrics, the full PACT-PAIR MCC decomposition, network-scale MCC validation, and all eight escalation-gate cells. These are not counted as newly run episodes; they are existing artifacts now made auditable in the response.</w:t>
+        <w:t xml:space="preserve">We separate the</w:t>
+      </w:r>
+      <w:r>
+        <w:t xml:space="preserve"> </w:t>
+      </w:r>
+      <w:r>
+        <w:rPr>
+          <w:b/>
+          <w:bCs/>
+        </w:rPr>
+        <w:t xml:space="preserve">scale of the evidence base</w:t>
+      </w:r>
+      <w:r>
+        <w:t xml:space="preserve"> </w:t>
+      </w:r>
+      <w:r>
+        <w:t xml:space="preserve">from the</w:t>
+      </w:r>
+      <w:r>
+        <w:t xml:space="preserve"> </w:t>
+      </w:r>
+      <w:r>
+        <w:rPr>
+          <w:b/>
+          <w:bCs/>
+        </w:rPr>
+        <w:t xml:space="preserve">smaller matched controls added for attribution</w:t>
+      </w:r>
+      <w:r>
+        <w:t xml:space="preserve">. The completed reviewer-requested controls comprise 480 policy-task episodes (8 policies × 60 tasks), 120 responder-policy episodes (4 cells × 30 tasks), 500 seeded relationship episodes, and 2,088 different-family judge calls. They should not obscure the substantially larger existing evaluations summarized below. The 600 additional States task responses planned for Table JD-2 are not included until strict finalization and judging complete.</w:t>
       </w:r>
     </w:p>
     <w:bookmarkEnd w:id="21"/>
@@ -1469,13 +1490,403 @@
       </w:r>
     </w:p>
     <w:bookmarkEnd w:id="22"/>
-    <w:bookmarkStart w:id="23" w:name="X4d33d3f2099ed4f615936c25b3d762f9343e761"/>
+    <w:bookmarkStart w:id="23" w:name="X4c59223a7c660dd583d2f01e2f5cb153a5efab8"/>
     <w:p>
       <w:pPr>
         <w:pStyle w:val="Heading3"/>
       </w:pPr>
       <w:r>
-        <w:t xml:space="preserve">1.3 Responder robustness on one canonical subset (Table GR-3)</w:t>
+        <w:t xml:space="preserve">1.3 The evidence base extends beyond the matched controls (Table GR-2a)</w:t>
+      </w:r>
+    </w:p>
+    <w:tbl>
+      <w:tblPr>
+        <w:tblStyle w:val="Table"/>
+        <w:tblW w:type="pct" w:w="5000"/>
+        <w:jc w:val="left"/>
+        <w:tblLayout w:type="fixed"/>
+        <w:tblLook w:firstRow="1" w:lastRow="0" w:firstColumn="0" w:lastColumn="0" w:noHBand="0" w:noVBand="0" w:val="0020"/>
+      </w:tblPr>
+      <w:tblGrid>
+        <w:gridCol w:w="1827"/>
+        <w:gridCol w:w="2436"/>
+        <w:gridCol w:w="1827"/>
+        <w:gridCol w:w="1827"/>
+      </w:tblGrid>
+      <w:tr>
+        <w:trPr>
+          <w:tblHeader w:val="on"/>
+        </w:trPr>
+        <w:tc>
+          <w:tcPr/>
+          <w:p>
+            <w:pPr>
+              <w:pStyle w:val="Compact"/>
+              <w:jc w:val="left"/>
+            </w:pPr>
+            <w:r>
+              <w:t xml:space="preserve">Evaluation layer</w:t>
+            </w:r>
+          </w:p>
+        </w:tc>
+        <w:tc>
+          <w:tcPr/>
+          <w:p>
+            <w:pPr>
+              <w:pStyle w:val="Compact"/>
+              <w:jc w:val="right"/>
+            </w:pPr>
+            <w:r>
+              <w:t xml:space="preserve">Evaluated scale</w:t>
+            </w:r>
+          </w:p>
+        </w:tc>
+        <w:tc>
+          <w:tcPr/>
+          <w:p>
+            <w:pPr>
+              <w:pStyle w:val="Compact"/>
+              <w:jc w:val="left"/>
+            </w:pPr>
+            <w:r>
+              <w:t xml:space="preserve">Main observation</w:t>
+            </w:r>
+          </w:p>
+        </w:tc>
+        <w:tc>
+          <w:tcPr/>
+          <w:p>
+            <w:pPr>
+              <w:pStyle w:val="Compact"/>
+              <w:jc w:val="left"/>
+            </w:pPr>
+            <w:r>
+              <w:t xml:space="preserve">Detailed evidence</w:t>
+            </w:r>
+          </w:p>
+        </w:tc>
+      </w:tr>
+      <w:tr>
+        <w:tc>
+          <w:tcPr/>
+          <w:p>
+            <w:pPr>
+              <w:pStyle w:val="Compact"/>
+              <w:jc w:val="left"/>
+            </w:pPr>
+            <w:r>
+              <w:t xml:space="preserve">PACT-PAIR main study</w:t>
+            </w:r>
+          </w:p>
+        </w:tc>
+        <w:tc>
+          <w:tcPr/>
+          <w:p>
+            <w:pPr>
+              <w:pStyle w:val="Compact"/>
+              <w:jc w:val="right"/>
+            </w:pPr>
+            <w:r>
+              <w:t xml:space="preserve">600-task benchmark; six requester-agent configurations on Files, plus States, Actions, multi-turn, and relationship settings</w:t>
+            </w:r>
+          </w:p>
+        </w:tc>
+        <w:tc>
+          <w:tcPr/>
+          <w:p>
+            <w:pPr>
+              <w:pStyle w:val="Compact"/>
+              <w:jc w:val="left"/>
+            </w:pPr>
+            <w:r>
+              <w:t xml:space="preserve">The D0→D2 security direction recurs across requester configurations and surfaces, with model- and surface-dependent utility costs</w:t>
+            </w:r>
+          </w:p>
+        </w:tc>
+        <w:tc>
+          <w:tcPr/>
+          <w:p>
+            <w:pPr>
+              <w:pStyle w:val="Compact"/>
+              <w:jc w:val="left"/>
+            </w:pPr>
+            <w:r>
+              <w:t xml:space="preserve">GR-1, AP-1–AP-4</w:t>
+            </w:r>
+          </w:p>
+        </w:tc>
+      </w:tr>
+      <w:tr>
+        <w:tc>
+          <w:tcPr/>
+          <w:p>
+            <w:pPr>
+              <w:pStyle w:val="Compact"/>
+              <w:jc w:val="left"/>
+            </w:pPr>
+            <w:r>
+              <w:t xml:space="preserve">PACT-NET baseline</w:t>
+            </w:r>
+          </w:p>
+        </w:tc>
+        <w:tc>
+          <w:tcPr/>
+          <w:p>
+            <w:pPr>
+              <w:pStyle w:val="Compact"/>
+              <w:jc w:val="right"/>
+            </w:pPr>
+            <w:r>
+              <w:t xml:space="preserve">25 agents; 4 clean runs × (997 Phase-1 tasks + 75 follow-up ticks) =</w:t>
+            </w:r>
+            <w:r>
+              <w:t xml:space="preserve"> </w:t>
+            </w:r>
+            <w:r>
+              <w:rPr>
+                <w:b/>
+                <w:bCs/>
+              </w:rPr>
+              <w:t xml:space="preserve">4,288 ticks</w:t>
+            </w:r>
+          </w:p>
+        </w:tc>
+        <w:tc>
+          <w:tcPr/>
+          <w:p>
+            <w:pPr>
+              <w:pStyle w:val="Compact"/>
+              <w:jc w:val="left"/>
+            </w:pPr>
+            <w:r>
+              <w:t xml:space="preserve">Static policy raises safety 26.6→71.5% while utility falls 88.7→78.8%; transitive and cross-cluster leakage remain high</w:t>
+            </w:r>
+          </w:p>
+        </w:tc>
+        <w:tc>
+          <w:tcPr/>
+          <w:p>
+            <w:pPr>
+              <w:pStyle w:val="Compact"/>
+              <w:jc w:val="left"/>
+            </w:pPr>
+            <w:r>
+              <w:t xml:space="preserve">JD-4, JD-5</w:t>
+            </w:r>
+          </w:p>
+        </w:tc>
+      </w:tr>
+      <w:tr>
+        <w:tc>
+          <w:tcPr/>
+          <w:p>
+            <w:pPr>
+              <w:pStyle w:val="Compact"/>
+              <w:jc w:val="left"/>
+            </w:pPr>
+            <w:r>
+              <w:t xml:space="preserve">PACT-PAIR structural mounting</w:t>
+            </w:r>
+          </w:p>
+        </w:tc>
+        <w:tc>
+          <w:tcPr/>
+          <w:p>
+            <w:pPr>
+              <w:pStyle w:val="Compact"/>
+              <w:jc w:val="right"/>
+            </w:pPr>
+            <w:r>
+              <w:t xml:space="preserve">3 conditions × 5 requester profiles × 400 questions =</w:t>
+            </w:r>
+            <w:r>
+              <w:t xml:space="preserve"> </w:t>
+            </w:r>
+            <w:r>
+              <w:rPr>
+                <w:b/>
+                <w:bCs/>
+              </w:rPr>
+              <w:t xml:space="preserve">6,000 condition-profile-question cells</w:t>
+            </w:r>
+          </w:p>
+        </w:tc>
+        <w:tc>
+          <w:tcPr/>
+          <w:p>
+            <w:pPr>
+              <w:pStyle w:val="Compact"/>
+              <w:jc w:val="left"/>
+            </w:pPr>
+            <w:r>
+              <w:t xml:space="preserve">Combining relationship policy with pre-retrieval mounting reduces aggregate disclosure 15.5→8.0%, at a utility cost of 70.9→58.5%</w:t>
+            </w:r>
+          </w:p>
+        </w:tc>
+        <w:tc>
+          <w:tcPr/>
+          <w:p>
+            <w:pPr>
+              <w:pStyle w:val="Compact"/>
+              <w:jc w:val="left"/>
+            </w:pPr>
+            <w:r>
+              <w:t xml:space="preserve">TT-1</w:t>
+            </w:r>
+          </w:p>
+        </w:tc>
+      </w:tr>
+      <w:tr>
+        <w:tc>
+          <w:tcPr/>
+          <w:p>
+            <w:pPr>
+              <w:pStyle w:val="Compact"/>
+              <w:jc w:val="left"/>
+            </w:pPr>
+            <w:r>
+              <w:t xml:space="preserve">PACT-NET structural validation</w:t>
+            </w:r>
+          </w:p>
+        </w:tc>
+        <w:tc>
+          <w:tcPr/>
+          <w:p>
+            <w:pPr>
+              <w:pStyle w:val="Compact"/>
+              <w:jc w:val="right"/>
+            </w:pPr>
+            <w:r>
+              <w:t xml:space="preserve">Replicated P0/P1 baselines plus two additional 1,072-tick MCC validation runs</w:t>
+            </w:r>
+          </w:p>
+        </w:tc>
+        <w:tc>
+          <w:tcPr/>
+          <w:p>
+            <w:pPr>
+              <w:pStyle w:val="Compact"/>
+              <w:jc w:val="left"/>
+            </w:pPr>
+            <w:r>
+              <w:t xml:space="preserve">Policy + mounting reaches the highest safety (77.8%) and lowest transitive leakage (67.0%), but the read-only mount collapses write utility</w:t>
+            </w:r>
+          </w:p>
+        </w:tc>
+        <w:tc>
+          <w:tcPr/>
+          <w:p>
+            <w:pPr>
+              <w:pStyle w:val="Compact"/>
+              <w:jc w:val="left"/>
+            </w:pPr>
+            <w:r>
+              <w:t xml:space="preserve">JD-6</w:t>
+            </w:r>
+          </w:p>
+        </w:tc>
+      </w:tr>
+      <w:tr>
+        <w:tc>
+          <w:tcPr/>
+          <w:p>
+            <w:pPr>
+              <w:pStyle w:val="Compact"/>
+              <w:jc w:val="left"/>
+            </w:pPr>
+            <w:r>
+              <w:t xml:space="preserve">Escalation-gate ablation</w:t>
+            </w:r>
+          </w:p>
+        </w:tc>
+        <w:tc>
+          <w:tcPr/>
+          <w:p>
+            <w:pPr>
+              <w:pStyle w:val="Compact"/>
+              <w:jc w:val="right"/>
+            </w:pPr>
+            <w:r>
+              <w:t xml:space="preserve">8 cells;</w:t>
+            </w:r>
+            <w:r>
+              <w:t xml:space="preserve"> </w:t>
+            </w:r>
+            <w:r>
+              <w:rPr>
+                <w:b/>
+                <w:bCs/>
+              </w:rPr>
+              <w:t xml:space="preserve">11,659 held-out gate decisions</w:t>
+            </w:r>
+            <w:r>
+              <w:t xml:space="preserve"> </w:t>
+            </w:r>
+            <w:r>
+              <w:t xml:space="preserve">across two models, three precedent representations, and two supervision levels</w:t>
+            </w:r>
+          </w:p>
+        </w:tc>
+        <w:tc>
+          <w:tcPr/>
+          <w:p>
+            <w:pPr>
+              <w:pStyle w:val="Compact"/>
+              <w:jc w:val="left"/>
+            </w:pPr>
+            <w:r>
+              <w:t xml:space="preserve">Private-request stopping remains 87.7–94.4%; added supervision chiefly recovers utility</w:t>
+            </w:r>
+          </w:p>
+        </w:tc>
+        <w:tc>
+          <w:tcPr/>
+          <w:p>
+            <w:pPr>
+              <w:pStyle w:val="Compact"/>
+              <w:jc w:val="left"/>
+            </w:pPr>
+            <w:r>
+              <w:t xml:space="preserve">JD-7</w:t>
+            </w:r>
+          </w:p>
+        </w:tc>
+      </w:tr>
+    </w:tbl>
+    <w:p>
+      <w:pPr>
+        <w:pStyle w:val="BodyText"/>
+      </w:pPr>
+      <w:r>
+        <w:t xml:space="preserve">These rows answer different questions and therefore must not be collapsed into one synthetic</w:t>
+      </w:r>
+      <w:r>
+        <w:t xml:space="preserve"> </w:t>
+      </w:r>
+      <w:r>
+        <w:t xml:space="preserve">“</w:t>
+      </w:r>
+      <w:r>
+        <w:t xml:space="preserve">total trial</w:t>
+      </w:r>
+      <w:r>
+        <w:t xml:space="preserve">”</w:t>
+      </w:r>
+      <w:r>
+        <w:t xml:space="preserve"> </w:t>
+      </w:r>
+      <w:r>
+        <w:t xml:space="preserve">count. PACT-NET action rows are response-heuristic scored; the network MCC rows are single-run validation conditions; and the escalation result evaluates the gate rather than the full end-to-end pipeline. The point is breadth with explicit units and caveats, not a numerically inflated headline.</w:t>
+      </w:r>
+    </w:p>
+    <w:bookmarkEnd w:id="23"/>
+    <w:bookmarkStart w:id="24" w:name="X4d33d3f2099ed4f615936c25b3d762f9343e761"/>
+    <w:p>
+      <w:pPr>
+        <w:pStyle w:val="Heading3"/>
+      </w:pPr>
+      <w:r>
+        <w:t xml:space="preserve">1.4 Responder robustness on one canonical subset (Table GR-3)</w:t>
       </w:r>
     </w:p>
     <w:p>
@@ -1822,14 +2233,14 @@
         <w:t xml:space="preserve">On this canonical subset, P2 reduces disclosure by 85 pp for DeepSeek V4 Flash and 75 pp for GLM 5.2 without reducing measured utility. Because each cell is one 30-question run, this is a responder-robustness check, not a population estimate.</w:t>
       </w:r>
     </w:p>
-    <w:bookmarkEnd w:id="23"/>
-    <w:bookmarkStart w:id="24" w:name="X8b04472f210df10996eefaa15ee518d502a79a5"/>
+    <w:bookmarkEnd w:id="24"/>
+    <w:bookmarkStart w:id="25" w:name="X8b04472f210df10996eefaa15ee518d502a79a5"/>
     <w:p>
       <w:pPr>
         <w:pStyle w:val="Heading3"/>
       </w:pPr>
       <w:r>
-        <w:t xml:space="preserve">1.4 Eight policy operating points on one fixed setting (Table GR-4)</w:t>
+        <w:t xml:space="preserve">1.5 Eight policy operating points on one fixed setting (Table GR-4)</w:t>
       </w:r>
     </w:p>
     <w:p>
@@ -1837,7 +2248,7 @@
         <w:pStyle w:val="FirstParagraph"/>
       </w:pPr>
       <w:r>
-        <w:t xml:space="preserve">To compare policy mechanisms without model or task-set confounds, all eight cells use the same 60 Files questions (20 public, 40 sensitive), gpt-5-mini requester/responder, and gpt-5-mini judge:</w:t>
+        <w:t xml:space="preserve">This is a reviewer-requested matched diagnostic, not the primary evidence of experimental scale. To compare policy mechanisms without model or task-set confounds, all eight cells use the same 60 Files questions (20 public, 40 sensitive), gpt-5-mini requester/responder, and gpt-5-mini judge:</w:t>
       </w:r>
     </w:p>
     <w:tbl>
@@ -2534,14 +2945,14 @@
         <w:t xml:space="preserve">These are eight discrete operating points, not a dense frontier. P3–P5 reduce disclosure to 5.0–12.5% but differ materially in utility and refusal; P6–P7 isolate the length/category components rather than serving as deployable governance recommendations.</w:t>
       </w:r>
     </w:p>
-    <w:bookmarkEnd w:id="24"/>
-    <w:bookmarkStart w:id="25" w:name="three-clarifications-used-throughout"/>
+    <w:bookmarkEnd w:id="25"/>
+    <w:bookmarkStart w:id="26" w:name="three-clarifications-used-throughout"/>
     <w:p>
       <w:pPr>
         <w:pStyle w:val="Heading3"/>
       </w:pPr>
       <w:r>
-        <w:t xml:space="preserve">1.5 Three clarifications used throughout</w:t>
+        <w:t xml:space="preserve">1.6 Three clarifications used throughout</w:t>
       </w:r>
     </w:p>
     <w:p>
@@ -2649,9 +3060,9 @@
         <w:t xml:space="preserve">exposure means the fact appearing anywhere in a persistent trajectory while serving other requests. Multi-turn interaction adds the second channel; it does not amplify the first (details in aP1N Q5). Security columns use one identical pipeline across all tables.</w:t>
       </w:r>
     </w:p>
-    <w:bookmarkEnd w:id="25"/>
     <w:bookmarkEnd w:id="26"/>
-    <w:bookmarkStart w:id="32" w:name="response-to-reviewer-ap1n"/>
+    <w:bookmarkEnd w:id="27"/>
+    <w:bookmarkStart w:id="33" w:name="response-to-reviewer-ap1n"/>
     <w:p>
       <w:pPr>
         <w:pStyle w:val="Heading2"/>
@@ -2668,7 +3079,7 @@
         <w:t xml:space="preserve">We thank the reviewer for recognizing the importance of the problem, the breadth of SharedOS, and the strength of the action track. The five questions below have concretely improved the paper; we answer them in order.</w:t>
       </w:r>
     </w:p>
-    <w:bookmarkStart w:id="27" w:name="Xbe8f7524aeaa53267fb612adf4c73f605f6c76f"/>
+    <w:bookmarkStart w:id="28" w:name="Xbe8f7524aeaa53267fb612adf4c73f605f6c76f"/>
     <w:p>
       <w:pPr>
         <w:pStyle w:val="Heading3"/>
@@ -2686,18 +3097,42 @@
           <w:b/>
           <w:bCs/>
         </w:rPr>
-        <w:t xml:space="preserve">Thank you for raising this framing concern; we agree, and we address it in both ways.</w:t>
+        <w:t xml:space="preserve">We agree with the reviewer’s terminological point, while clarifying that the study already evaluates a broad set of operating points.</w:t>
       </w:r>
       <w:r>
         <w:t xml:space="preserve"> </w:t>
       </w:r>
       <w:r>
-        <w:t xml:space="preserve">First, the wording: the revision replaces</w:t>
+        <w:t xml:space="preserve">The submitted evaluation is not limited to a three-point D0/D1/D2 plot: it varies six requester-agent configurations on Files, three data surfaces, two model settings under the full multi-turn protocol, D2–D5 prompt-defence packages, and relationship-conditioned requesters. The revision additionally makes the existing network and architectural evaluations auditable: four clean PACT-NET runs over 4,288 ticks, 6,000 PACT-PAIR structural-mounting cells, two network-scale MCC validation runs, and 11,659 held-out escalation-gate decisions (Table GR-2a; detailed in JD-4–JD-7 and TT-1).</w:t>
+      </w:r>
+    </w:p>
+    <w:p>
+      <w:pPr>
+        <w:pStyle w:val="BodyText"/>
+      </w:pPr>
+      <w:r>
+        <w:t xml:space="preserve">What these experiments do</w:t>
       </w:r>
       <w:r>
         <w:t xml:space="preserve"> </w:t>
       </w:r>
       <w:r>
+        <w:rPr>
+          <w:b/>
+          <w:bCs/>
+        </w:rPr>
+        <w:t xml:space="preserve">not</w:t>
+      </w:r>
+      <w:r>
+        <w:t xml:space="preserve"> </w:t>
+      </w:r>
+      <w:r>
+        <w:t xml:space="preserve">provide is dense sampling along one continuous intervention axis from which a Pareto boundary could be estimated. The evaluated points vary policies, models, surfaces, relationships, and architectures, so fitting or claiming a continuous frontier would be unjustified. We therefore replace</w:t>
+      </w:r>
+      <w:r>
+        <w:t xml:space="preserve"> </w:t>
+      </w:r>
+      <w:r>
         <w:t xml:space="preserve">“</w:t>
       </w:r>
       <w:r>
@@ -2710,7 +3145,7 @@
         <w:t xml:space="preserve"> </w:t>
       </w:r>
       <w:r>
-        <w:t xml:space="preserve">with</w:t>
+        <w:t xml:space="preserve">throughout with</w:t>
       </w:r>
       <w:r>
         <w:t xml:space="preserve"> </w:t>
@@ -2726,7 +3161,15 @@
         <w:t xml:space="preserve"> </w:t>
       </w:r>
       <w:r>
-        <w:t xml:space="preserve">everywhere and no longer suggests interpolation. Second, more points: Table GR-4 now reports eight policy packages on the same 60 questions and fixed gpt-5-mini requester/responder/judge. The submitted P0/P1/P2 anchors are joined by three supplementary defenses (P3–P5) and two controlled ablations (P6–P7). Disclosure spans 87.5% to 5.0%, while utility spans 95.0% to 65.0%; the lowest-disclosure packages are not interchangeable because their refusal rates range from 72.5% to 95.0%. Table GR-3 then tests the orthogonal responder axis on one canonical 30-question subset: P2 cuts disclosure from 90% to 5% for DeepSeek V4 Flash and from 80% to 5% for GLM 5.2. These are discrete, auditable operating points, not a fitted Pareto boundary.</w:t>
+        <w:t xml:space="preserve">and no longer suggest interpolation.</w:t>
+      </w:r>
+    </w:p>
+    <w:p>
+      <w:pPr>
+        <w:pStyle w:val="BodyText"/>
+      </w:pPr>
+      <w:r>
+        <w:t xml:space="preserve">The two new small-scale tables serve a different purpose: attribution under matched conditions. Table GR-4 holds the model and 60-question set fixed while comparing eight policy packages; Table GR-3 holds a canonical 30-question set fixed while varying the responder. GR-4 spans 65–95% utility and 5–87.5% disclosure, while GR-3 reproduces the P0→P2 disclosure reduction for DeepSeek V4 Flash (90→5%) and GLM 5.2 (80→5%). We treat these as controlled diagnostics that complement the larger evidence base, not as the reason the paper has enough operating points and not as a fitted Pareto analysis.</w:t>
       </w:r>
     </w:p>
     <w:p>
@@ -3720,11 +4163,11 @@
         <w:pStyle w:val="BodyText"/>
       </w:pPr>
       <w:r>
-        <w:t xml:space="preserve">The pattern matches the single-step ablation: literature defences buy 4 to 11 pp of scan-leak reduction and 5.5 to 7.5 pp of action safety at a 6 to 13 pp fact-coverage cost, and no prompt-level package closes the incidental-disclosure channel. On the fixed backbone, the response reports eleven judged policy packages (eight single-step and three additional multi-step defences); Table AP-1 adds six model-policy cells, and Table GR-3 separately varies the responder.</w:t>
+        <w:t xml:space="preserve">The pattern matches the single-step ablation: literature defences buy 4 to 11 pp of scan-leak reduction and 5.5 to 7.5 pp of action safety at a 6 to 13 pp fact-coverage cost, and no prompt-level package closes the incidental-disclosure channel. On the fixed backbone, the response reports eleven judged policy packages (eight single-step and three additional multi-step defences); Table AP-1 adds six model-policy cells, and Table GR-3 separately varies the responder. These matched comparisons sharpen attribution; the larger dyadic, network, structural, and escalation evaluations in Table GR-2a establish breadth.</w:t>
       </w:r>
     </w:p>
-    <w:bookmarkEnd w:id="27"/>
-    <w:bookmarkStart w:id="28" w:name="X44da69f244e6550092b2d686c839324415a7b08"/>
+    <w:bookmarkEnd w:id="28"/>
+    <w:bookmarkStart w:id="29" w:name="X44da69f244e6550092b2d686c839324415a7b08"/>
     <w:p>
       <w:pPr>
         <w:pStyle w:val="Heading3"/>
@@ -3961,8 +4404,8 @@
         <w:t xml:space="preserve">also fails, because at matched length the category-specific package still leaks 4.7 times less (7.5% vs 35.0%). The utility cost sits almost entirely in the full D2 package: utility drops to 65.0%, with 5 of the 20 legitimate queries refused, while every other cell stays at 85 to 90%. (On the 40 sensitive items, D2 refuses 29, which is the intended behavior.) So over-refusal of legitimate requests appears specifically when length and category enumeration are combined. In our revision we will replace the phrase about the policies differing only in specificity with exactly this decomposition, reported as measured on this new 60-task subset rather than folded into the original 200-task tables.</w:t>
       </w:r>
     </w:p>
-    <w:bookmarkEnd w:id="28"/>
-    <w:bookmarkStart w:id="29" w:name="q3.-reconciling-tables-15-and-20"/>
+    <w:bookmarkEnd w:id="29"/>
+    <w:bookmarkStart w:id="30" w:name="q3.-reconciling-tables-15-and-20"/>
     <w:p>
       <w:pPr>
         <w:pStyle w:val="Heading3"/>
@@ -4024,8 +4467,8 @@
         <w:t xml:space="preserve">, and move it to the appendix. Both tables show the same D0 &gt; D1 &gt; D2 utility ordering. We agree the distinction should have been explicit, and the change will improve the readability of the paper.</w:t>
       </w:r>
     </w:p>
-    <w:bookmarkEnd w:id="29"/>
-    <w:bookmarkStart w:id="30" w:name="X3396b66f387d3037fc1ad780e54e9f696a99ce6"/>
+    <w:bookmarkEnd w:id="30"/>
+    <w:bookmarkStart w:id="31" w:name="X3396b66f387d3037fc1ad780e54e9f696a99ce6"/>
     <w:p>
       <w:pPr>
         <w:pStyle w:val="Heading3"/>
@@ -4762,8 +5205,8 @@
         <w:t xml:space="preserve">With requester-specific policies (GPT-5.5, 5 requesters × 400 QA), over-refusal drops substantially: utility reaches 87.4% (colleague), 87.1% (delegate), and 87.4% (investor). But failures do not disappear; the close-friend profile stays at 63.3% utility with 38.7% P+B disclosure. So mis-calibration is not attributable solely to relationship-agnostic prompting; we conjecture it also reflects conservative category priors in current models. We report this baseline as an additional operating point and state explicitly that model and package differ from the submitted RQ3 cell; a matched run on the original GPT-5-mini setup is future work, and we do not claim it here.</w:t>
       </w:r>
     </w:p>
-    <w:bookmarkEnd w:id="30"/>
-    <w:bookmarkStart w:id="31" w:name="X0052d8b3b47dae8ababdff0dfcb364c02f01d92"/>
+    <w:bookmarkEnd w:id="31"/>
+    <w:bookmarkStart w:id="32" w:name="X0052d8b3b47dae8ababdff0dfcb364c02f01d92"/>
     <w:p>
       <w:pPr>
         <w:pStyle w:val="Heading3"/>
@@ -5907,9 +6350,9 @@
         <w:t xml:space="preserve">Most residual leakage is not an obvious-PII failure; it is boundary ambiguity in organisational data. The second row also shows why attributed-response scoring and trajectory-level auditing answer different questions.</w:t>
       </w:r>
     </w:p>
-    <w:bookmarkEnd w:id="31"/>
     <w:bookmarkEnd w:id="32"/>
-    <w:bookmarkStart w:id="38" w:name="response-to-reviewer-jd3a"/>
+    <w:bookmarkEnd w:id="33"/>
+    <w:bookmarkStart w:id="39" w:name="response-to-reviewer-jd3a"/>
     <w:p>
       <w:pPr>
         <w:pStyle w:val="Heading2"/>
@@ -5926,7 +6369,7 @@
         <w:t xml:space="preserve">We are excited to receive the positive assessment, and we thank the reviewer for recognizing the database-diff action evaluation, the statistical reporting, the read/write-trust distinction, the metadata channel, and the wedding-cascade case study. We answer the four questions, then the limitations and presentation points.</w:t>
       </w:r>
     </w:p>
-    <w:bookmarkStart w:id="33" w:name="q1.-different-family-judge"/>
+    <w:bookmarkStart w:id="34" w:name="q1.-different-family-judge"/>
     <w:p>
       <w:pPr>
         <w:pStyle w:val="Heading3"/>
@@ -6243,8 +6686,8 @@
         <w:t xml:space="preserve">(29 cases) than the reverse (5); nevertheless, the D2 ordering and low-disclosure conclusion remain. Rates here use the gradable-only denominator for judge agreement and do not replace the manuscript’s fixed-200 headline rates, which count no-response as failure.</w:t>
       </w:r>
     </w:p>
-    <w:bookmarkEnd w:id="33"/>
-    <w:bookmarkStart w:id="34" w:name="q2.-bounding-the-d2-states-qa-variance"/>
+    <w:bookmarkEnd w:id="34"/>
+    <w:bookmarkStart w:id="35" w:name="q2.-bounding-the-d2-states-qa-variance"/>
     <w:p>
       <w:pPr>
         <w:pStyle w:val="Heading3"/>
@@ -6287,8 +6730,8 @@
         <w:t xml:space="preserve">direction repeats in both (disclosure falls from 58% to 5% in one and from 59% to 11% in the other; McNemar p&lt;.001 each), while D2 States utility spans 5 to 31%. The mechanism, on inspection: under a strict D2, States utility depends on whether early trajectory context happens to include the queried state objects, and small per-cell denominators amplify this; the submitted item set was small for this cell. The revision therefore (i) reports the D2 States utility as the observed range with this mechanism, not as a point estimate, (ii) states the n=2 limitation explicitly in Limitations, and (iii) keeps the surface-asymmetry claim only in the direction the replications support: the security effect is robust; the utility magnitude is uncertain and reported with its spread. Additional replications under the original protocol are future work; we do not claim them in this response.</w:t>
       </w:r>
     </w:p>
-    <w:bookmarkEnd w:id="34"/>
-    <w:bookmarkStart w:id="35" w:name="q3.-rq3-beyond-gpt-5-mini"/>
+    <w:bookmarkEnd w:id="35"/>
+    <w:bookmarkStart w:id="36" w:name="q3.-rq3-beyond-gpt-5-mini"/>
     <w:p>
       <w:pPr>
         <w:pStyle w:val="Heading3"/>
@@ -6732,8 +7175,8 @@
         <w:t xml:space="preserve">The utility denominator varies because the scenario contract assigns different numbers of legitimate items to each profile; security is evaluated on the remaining protected/borderline items. The close-friend disclosure concentration replicates as a qualitative failure mode, while the delegate profile occupies a different, highly conservative operating point. Because the GPT-5.5 and GLM packages cover different task ranges and policy implementations, we do not compare their absolute utility rates as a controlled model effect; together they show that relationship-conditioned behavior remains model- and package-dependent.</w:t>
       </w:r>
     </w:p>
-    <w:bookmarkEnd w:id="35"/>
-    <w:bookmarkStart w:id="36" w:name="q4.-interventions-mvp"/>
+    <w:bookmarkEnd w:id="36"/>
+    <w:bookmarkStart w:id="37" w:name="q4.-interventions-mvp"/>
     <w:p>
       <w:pPr>
         <w:pStyle w:val="Heading3"/>
@@ -9297,8 +9740,8 @@
         <w:t xml:space="preserve">Together these results demonstrate three distinct enforcement layers: static policy handles visible violations, mounting limits reachable context, and escalation moves ambiguous decisions to the tool boundary. None dominates without cost. The PACT-NET action-family rows above are response-heuristic scored because those runs predate DB-diff instrumentation; we use them as directional evidence and reserve strong action claims for the instrumented PACT-PAIR track.</w:t>
       </w:r>
     </w:p>
-    <w:bookmarkEnd w:id="36"/>
-    <w:bookmarkStart w:id="37" w:name="weaknesses-and-limitations"/>
+    <w:bookmarkEnd w:id="37"/>
+    <w:bookmarkStart w:id="38" w:name="weaknesses-and-limitations"/>
     <w:p>
       <w:pPr>
         <w:pStyle w:val="Heading3"/>
@@ -9435,9 +9878,9 @@
         <w:t xml:space="preserve">Tables 32–39 captions and the missing table reference are fixed in the revision. Thank you for catching these.</w:t>
       </w:r>
     </w:p>
-    <w:bookmarkEnd w:id="37"/>
     <w:bookmarkEnd w:id="38"/>
-    <w:bookmarkStart w:id="45" w:name="response-to-reviewer-ttbh"/>
+    <w:bookmarkEnd w:id="39"/>
+    <w:bookmarkStart w:id="46" w:name="response-to-reviewer-ttbh"/>
     <w:p>
       <w:pPr>
         <w:pStyle w:val="Heading2"/>
@@ -9454,7 +9897,7 @@
         <w:t xml:space="preserve">We sincerely thank the reviewer for the expert, access-control-informed review. The three main requests, namely independent label validation, a component-controlled policy ablation, and a structural access-control baseline, are exactly the right tests for this work, and we have run or are completing all of them. We answer the five questions in order.</w:t>
       </w:r>
     </w:p>
-    <w:bookmarkStart w:id="39" w:name="X452f84490592b338eec1be6a6dcbdb407b1d415"/>
+    <w:bookmarkStart w:id="40" w:name="X452f84490592b338eec1be6a6dcbdb407b1d415"/>
     <w:p>
       <w:pPr>
         <w:pStyle w:val="Heading3"/>
@@ -9762,8 +10205,8 @@
         <w:t xml:space="preserve">, that is, explicit and self-consistent authorization stipulations for one concrete scenario, instantiating the variables that contextual integrity and ReBAC/ABAC identify (requester, relationship, object, operation, context). They are not claims about universal social norms, and the revision says so in Limitations, as the reviewer requests. The requester set is a maximum-contrast design, not a representative sample: 70 of the 99 relationship-conditioned sensitive items change label across requesters, and the close-friend and investor profiles differ on 55 of them. The investor (a lead Series A investor and non-voting board observer with stipulated information rights) exists precisely to break a scalar-trust reading: narrow legitimate company-information rights, and no entitlement to the founder’s health or personal finances. What the benchmark measures is whether an agent can realize a stipulated information-flow contract while remaining useful; that is the construct the labels need to support, and the one the independent annotation study tests.</w:t>
       </w:r>
     </w:p>
-    <w:bookmarkEnd w:id="39"/>
-    <w:bookmarkStart w:id="40" w:name="q2.-cleaner-policy-specificity-ablation"/>
+    <w:bookmarkEnd w:id="40"/>
+    <w:bookmarkStart w:id="41" w:name="q2.-cleaner-policy-specificity-ablation"/>
     <w:p>
       <w:pPr>
         <w:pStyle w:val="Heading3"/>
@@ -9826,8 +10269,8 @@
         <w:t xml:space="preserve">survives the data. The phrase about the policies differing only in specificity is removed from the paper accordingly. On schema overlap: the short category-specific control (P7) names the sensitive categories without the benchmark’s examples or action rules, and still reduces disclosure from 75.0% to 42.5%, evidence that naming the protected categories helps in itself, though far short of the full package’s 7.5%.</w:t>
       </w:r>
     </w:p>
-    <w:bookmarkEnd w:id="40"/>
-    <w:bookmarkStart w:id="41" w:name="q3.-structural-non-ml-baseline"/>
+    <w:bookmarkEnd w:id="41"/>
+    <w:bookmarkStart w:id="42" w:name="q3.-structural-non-ml-baseline"/>
     <w:p>
       <w:pPr>
         <w:pStyle w:val="Heading3"/>
@@ -10588,8 +11031,8 @@
         <w:t xml:space="preserve">into its four distinct layers (prompt policy, mounted reachability, contact ACLs, pre-tool escalation) rather than treating them as one mechanism.</w:t>
       </w:r>
     </w:p>
-    <w:bookmarkEnd w:id="41"/>
-    <w:bookmarkStart w:id="42" w:name="q4.-frontier-terminology"/>
+    <w:bookmarkEnd w:id="42"/>
+    <w:bookmarkStart w:id="43" w:name="q4.-frontier-terminology"/>
     <w:p>
       <w:pPr>
         <w:pStyle w:val="Heading3"/>
@@ -10625,13 +11068,10 @@
           <w:b/>
           <w:bCs/>
         </w:rPr>
-        <w:t xml:space="preserve">We agree and thank the reviewer for the suggestion; we adopt the more conservative wording</w:t>
+        <w:t xml:space="preserve">We agree and adopt the more accurate wording</w:t>
       </w:r>
       <w:r>
         <w:t xml:space="preserve"> </w:t>
-      </w:r>
-      <w:r>
-        <w:t xml:space="preserve">(</w:t>
       </w:r>
       <w:r>
         <w:rPr>
@@ -10641,11 +11081,14 @@
         <w:t xml:space="preserve">security–utility trade-offs across discrete operating points</w:t>
       </w:r>
       <w:r>
-        <w:t xml:space="preserve">) throughout, while also densifying the measured points to eight judged single-step policy packages (Table GR-4) plus three literature-derived defences under the multi-step protocol (reply to aP1N Q1). Responder robustness is reported separately on one canonical 30-question subset (Table GR-3), rather than conflated with the policy comparison. No dense-Pareto claim is made anywhere in the revision.</w:t>
+        <w:t xml:space="preserve"> </w:t>
+      </w:r>
+      <w:r>
+        <w:t xml:space="preserve">throughout. The change is terminological, not an admission that the evidence consisted of only a few experiments: Table GR-2a consolidates the already-evaluated dyadic, multi-turn, network, structural, and escalation settings, while the detailed results appear in GR-1, AP-1–AP-4, JD-4–JD-7, and TT-1. The new 60-question policy comparison and 30-question responder check are explicitly labelled as matched controls for attribution, not as substitutes for that larger evidence base or as a fitted Pareto analysis.</w:t>
       </w:r>
     </w:p>
-    <w:bookmarkEnd w:id="42"/>
-    <w:bookmarkStart w:id="43" w:name="Xc51a8dc20b55a5c769306427373724e402605cb"/>
+    <w:bookmarkEnd w:id="43"/>
+    <w:bookmarkStart w:id="44" w:name="Xc51a8dc20b55a5c769306427373724e402605cb"/>
     <w:p>
       <w:pPr>
         <w:pStyle w:val="Heading3"/>
@@ -10672,8 +11115,8 @@
         <w:t xml:space="preserve">(i) Judge-independent gold-string scoring reproduces every headline security direction (States disclosure falls from 47.5% to 6.5%; multi-turn semantic/string agreement is 93.7%). (ii) DeepSeek V4 Flash re-scores every gradable response from both single-step surfaces using the submitted rubric: Files agreement is 98.3% over 1,058 items, and States agreement is 91.6% over 1,030 items (88.8% utility, 94.3% security). Table JD-1 reports the full comparison: States is more judge-sensitive than Files, but D2 remains the lowest-disclosure package under both judges (7.5% original vs 5.7% DeepSeek on gradable items). We do not yet claim different-family robustness for multi-turn because its full trajectory inputs have not been reconstructed for re-scoring. (iii) A human audit of disagreements is grounded in the returned independent annotations: all 458 non-unanimous items carry an adjudication column, and the 100 cells where the annotator majority disagrees with our gold ship as adjudication records (details in our reply to Q1).</w:t>
       </w:r>
     </w:p>
-    <w:bookmarkEnd w:id="43"/>
-    <w:bookmarkStart w:id="44" w:name="presentation-and-limitations"/>
+    <w:bookmarkEnd w:id="44"/>
+    <w:bookmarkStart w:id="45" w:name="presentation-and-limitations"/>
     <w:p>
       <w:pPr>
         <w:pStyle w:val="Heading3"/>
@@ -10708,9 +11151,9 @@
         <w:t xml:space="preserve">conclusions concern prompt-level policies plus the structural mechanisms actually tested. We hope the added experiments, scoped claims, and framing of this work as a first controlled exploration of cross-boundary A2A delegation address the concerns, and we welcome further discussion.</w:t>
       </w:r>
     </w:p>
-    <w:bookmarkEnd w:id="44"/>
     <w:bookmarkEnd w:id="45"/>
     <w:bookmarkEnd w:id="46"/>
+    <w:bookmarkEnd w:id="47"/>
     <w:sectPr/>
   </w:body>
 </w:document>

</xml_diff>